<commit_message>
Deck review: full-width architecture slide, BA-18 trap and TC-03 mutations on slide 6, new 'How I used AI tools' slide (15 slides)
BA-18 claim verified first: read-only probe, deployed CitationValidator rejects computed margins 1.4% / 1.43% / 'about 1.4 percent' (recorded in the spec). AI_TOOLING_LOG: the unlogged 686646f incident (YAML validation not gating the commit) added, 21 entries. TC-02 clarification on admin/integration-profile log access in the CSV, TC-02.md and the Test Protocol; REQ-19 unchanged.
</commit_message>
<xml_diff>
--- a/docs/Test_Protocol.docx
+++ b/docs/Test_Protocol.docx
@@ -938,7 +938,7 @@
       <w:r>
         <w:fldChar w:fldCharType="separate"/>
       </w:r>
-      <w:hyperlink w:anchor="_Toc242862078" w:history="1">
+      <w:hyperlink w:anchor="_Toc242862927" w:history="1">
         <w:r>
           <w:rPr>
             <w:rStyle w:val="Hyperlink"/>
@@ -965,7 +965,7 @@
             <w:noProof/>
             <w:webHidden/>
           </w:rPr>
-          <w:instrText xml:space="preserve"> PAGEREF _Toc242862078 \h </w:instrText>
+          <w:instrText xml:space="preserve"> PAGEREF _Toc242862927 \h </w:instrText>
         </w:r>
         <w:r>
           <w:rPr>
@@ -1011,7 +1011,7 @@
           <w14:ligatures w14:val="standardContextual"/>
         </w:rPr>
       </w:pPr>
-      <w:hyperlink w:anchor="_Toc242862079" w:history="1">
+      <w:hyperlink w:anchor="_Toc242862928" w:history="1">
         <w:r>
           <w:rPr>
             <w:rStyle w:val="Hyperlink"/>
@@ -1038,7 +1038,7 @@
             <w:noProof/>
             <w:webHidden/>
           </w:rPr>
-          <w:instrText xml:space="preserve"> PAGEREF _Toc242862079 \h </w:instrText>
+          <w:instrText xml:space="preserve"> PAGEREF _Toc242862928 \h </w:instrText>
         </w:r>
         <w:r>
           <w:rPr>
@@ -1084,7 +1084,7 @@
           <w14:ligatures w14:val="standardContextual"/>
         </w:rPr>
       </w:pPr>
-      <w:hyperlink w:anchor="_Toc242862080" w:history="1">
+      <w:hyperlink w:anchor="_Toc242862929" w:history="1">
         <w:r>
           <w:rPr>
             <w:rStyle w:val="Hyperlink"/>
@@ -1111,7 +1111,7 @@
             <w:noProof/>
             <w:webHidden/>
           </w:rPr>
-          <w:instrText xml:space="preserve"> PAGEREF _Toc242862080 \h </w:instrText>
+          <w:instrText xml:space="preserve"> PAGEREF _Toc242862929 \h </w:instrText>
         </w:r>
         <w:r>
           <w:rPr>
@@ -1157,7 +1157,7 @@
           <w14:ligatures w14:val="standardContextual"/>
         </w:rPr>
       </w:pPr>
-      <w:hyperlink w:anchor="_Toc242862081" w:history="1">
+      <w:hyperlink w:anchor="_Toc242862930" w:history="1">
         <w:r>
           <w:rPr>
             <w:rStyle w:val="Hyperlink"/>
@@ -1184,7 +1184,7 @@
             <w:noProof/>
             <w:webHidden/>
           </w:rPr>
-          <w:instrText xml:space="preserve"> PAGEREF _Toc242862081 \h </w:instrText>
+          <w:instrText xml:space="preserve"> PAGEREF _Toc242862930 \h </w:instrText>
         </w:r>
         <w:r>
           <w:rPr>
@@ -1230,7 +1230,7 @@
           <w14:ligatures w14:val="standardContextual"/>
         </w:rPr>
       </w:pPr>
-      <w:hyperlink w:anchor="_Toc242862082" w:history="1">
+      <w:hyperlink w:anchor="_Toc242862931" w:history="1">
         <w:r>
           <w:rPr>
             <w:rStyle w:val="Hyperlink"/>
@@ -1257,7 +1257,7 @@
             <w:noProof/>
             <w:webHidden/>
           </w:rPr>
-          <w:instrText xml:space="preserve"> PAGEREF _Toc242862082 \h </w:instrText>
+          <w:instrText xml:space="preserve"> PAGEREF _Toc242862931 \h </w:instrText>
         </w:r>
         <w:r>
           <w:rPr>
@@ -1303,7 +1303,7 @@
           <w14:ligatures w14:val="standardContextual"/>
         </w:rPr>
       </w:pPr>
-      <w:hyperlink w:anchor="_Toc242862083" w:history="1">
+      <w:hyperlink w:anchor="_Toc242862932" w:history="1">
         <w:r>
           <w:rPr>
             <w:rStyle w:val="Hyperlink"/>
@@ -1330,7 +1330,7 @@
             <w:noProof/>
             <w:webHidden/>
           </w:rPr>
-          <w:instrText xml:space="preserve"> PAGEREF _Toc242862083 \h </w:instrText>
+          <w:instrText xml:space="preserve"> PAGEREF _Toc242862932 \h </w:instrText>
         </w:r>
         <w:r>
           <w:rPr>
@@ -1376,7 +1376,7 @@
           <w14:ligatures w14:val="standardContextual"/>
         </w:rPr>
       </w:pPr>
-      <w:hyperlink w:anchor="_Toc242862084" w:history="1">
+      <w:hyperlink w:anchor="_Toc242862933" w:history="1">
         <w:r>
           <w:rPr>
             <w:rStyle w:val="Hyperlink"/>
@@ -1403,7 +1403,7 @@
             <w:noProof/>
             <w:webHidden/>
           </w:rPr>
-          <w:instrText xml:space="preserve"> PAGEREF _Toc242862084 \h </w:instrText>
+          <w:instrText xml:space="preserve"> PAGEREF _Toc242862933 \h </w:instrText>
         </w:r>
         <w:r>
           <w:rPr>
@@ -1449,7 +1449,7 @@
           <w14:ligatures w14:val="standardContextual"/>
         </w:rPr>
       </w:pPr>
-      <w:hyperlink w:anchor="_Toc242862085" w:history="1">
+      <w:hyperlink w:anchor="_Toc242862934" w:history="1">
         <w:r>
           <w:rPr>
             <w:rStyle w:val="Hyperlink"/>
@@ -1476,7 +1476,7 @@
             <w:noProof/>
             <w:webHidden/>
           </w:rPr>
-          <w:instrText xml:space="preserve"> PAGEREF _Toc242862085 \h </w:instrText>
+          <w:instrText xml:space="preserve"> PAGEREF _Toc242862934 \h </w:instrText>
         </w:r>
         <w:r>
           <w:rPr>
@@ -1522,7 +1522,7 @@
           <w14:ligatures w14:val="standardContextual"/>
         </w:rPr>
       </w:pPr>
-      <w:hyperlink w:anchor="_Toc242862086" w:history="1">
+      <w:hyperlink w:anchor="_Toc242862935" w:history="1">
         <w:r>
           <w:rPr>
             <w:rStyle w:val="Hyperlink"/>
@@ -1549,7 +1549,7 @@
             <w:noProof/>
             <w:webHidden/>
           </w:rPr>
-          <w:instrText xml:space="preserve"> PAGEREF _Toc242862086 \h </w:instrText>
+          <w:instrText xml:space="preserve"> PAGEREF _Toc242862935 \h </w:instrText>
         </w:r>
         <w:r>
           <w:rPr>
@@ -1595,7 +1595,7 @@
           <w14:ligatures w14:val="standardContextual"/>
         </w:rPr>
       </w:pPr>
-      <w:hyperlink w:anchor="_Toc242862087" w:history="1">
+      <w:hyperlink w:anchor="_Toc242862936" w:history="1">
         <w:r>
           <w:rPr>
             <w:rStyle w:val="Hyperlink"/>
@@ -1622,7 +1622,7 @@
             <w:noProof/>
             <w:webHidden/>
           </w:rPr>
-          <w:instrText xml:space="preserve"> PAGEREF _Toc242862087 \h </w:instrText>
+          <w:instrText xml:space="preserve"> PAGEREF _Toc242862936 \h </w:instrText>
         </w:r>
         <w:r>
           <w:rPr>
@@ -1668,7 +1668,7 @@
           <w14:ligatures w14:val="standardContextual"/>
         </w:rPr>
       </w:pPr>
-      <w:hyperlink w:anchor="_Toc242862088" w:history="1">
+      <w:hyperlink w:anchor="_Toc242862937" w:history="1">
         <w:r>
           <w:rPr>
             <w:rStyle w:val="Hyperlink"/>
@@ -1695,7 +1695,7 @@
             <w:noProof/>
             <w:webHidden/>
           </w:rPr>
-          <w:instrText xml:space="preserve"> PAGEREF _Toc242862088 \h </w:instrText>
+          <w:instrText xml:space="preserve"> PAGEREF _Toc242862937 \h </w:instrText>
         </w:r>
         <w:r>
           <w:rPr>
@@ -1741,7 +1741,7 @@
           <w14:ligatures w14:val="standardContextual"/>
         </w:rPr>
       </w:pPr>
-      <w:hyperlink w:anchor="_Toc242862089" w:history="1">
+      <w:hyperlink w:anchor="_Toc242862938" w:history="1">
         <w:r>
           <w:rPr>
             <w:rStyle w:val="Hyperlink"/>
@@ -1768,7 +1768,7 @@
             <w:noProof/>
             <w:webHidden/>
           </w:rPr>
-          <w:instrText xml:space="preserve"> PAGEREF _Toc242862089 \h </w:instrText>
+          <w:instrText xml:space="preserve"> PAGEREF _Toc242862938 \h </w:instrText>
         </w:r>
         <w:r>
           <w:rPr>
@@ -1814,7 +1814,7 @@
           <w14:ligatures w14:val="standardContextual"/>
         </w:rPr>
       </w:pPr>
-      <w:hyperlink w:anchor="_Toc242862090" w:history="1">
+      <w:hyperlink w:anchor="_Toc242862939" w:history="1">
         <w:r>
           <w:rPr>
             <w:rStyle w:val="Hyperlink"/>
@@ -1841,7 +1841,7 @@
             <w:noProof/>
             <w:webHidden/>
           </w:rPr>
-          <w:instrText xml:space="preserve"> PAGEREF _Toc242862090 \h </w:instrText>
+          <w:instrText xml:space="preserve"> PAGEREF _Toc242862939 \h </w:instrText>
         </w:r>
         <w:r>
           <w:rPr>
@@ -1887,7 +1887,7 @@
           <w14:ligatures w14:val="standardContextual"/>
         </w:rPr>
       </w:pPr>
-      <w:hyperlink w:anchor="_Toc242862091" w:history="1">
+      <w:hyperlink w:anchor="_Toc242862940" w:history="1">
         <w:r>
           <w:rPr>
             <w:rStyle w:val="Hyperlink"/>
@@ -1914,7 +1914,7 @@
             <w:noProof/>
             <w:webHidden/>
           </w:rPr>
-          <w:instrText xml:space="preserve"> PAGEREF _Toc242862091 \h </w:instrText>
+          <w:instrText xml:space="preserve"> PAGEREF _Toc242862940 \h </w:instrText>
         </w:r>
         <w:r>
           <w:rPr>
@@ -1960,7 +1960,7 @@
           <w14:ligatures w14:val="standardContextual"/>
         </w:rPr>
       </w:pPr>
-      <w:hyperlink w:anchor="_Toc242862092" w:history="1">
+      <w:hyperlink w:anchor="_Toc242862941" w:history="1">
         <w:r>
           <w:rPr>
             <w:rStyle w:val="Hyperlink"/>
@@ -1987,7 +1987,7 @@
             <w:noProof/>
             <w:webHidden/>
           </w:rPr>
-          <w:instrText xml:space="preserve"> PAGEREF _Toc242862092 \h </w:instrText>
+          <w:instrText xml:space="preserve"> PAGEREF _Toc242862941 \h </w:instrText>
         </w:r>
         <w:r>
           <w:rPr>
@@ -2033,7 +2033,7 @@
           <w14:ligatures w14:val="standardContextual"/>
         </w:rPr>
       </w:pPr>
-      <w:hyperlink w:anchor="_Toc242862093" w:history="1">
+      <w:hyperlink w:anchor="_Toc242862942" w:history="1">
         <w:r>
           <w:rPr>
             <w:rStyle w:val="Hyperlink"/>
@@ -2060,7 +2060,7 @@
             <w:noProof/>
             <w:webHidden/>
           </w:rPr>
-          <w:instrText xml:space="preserve"> PAGEREF _Toc242862093 \h </w:instrText>
+          <w:instrText xml:space="preserve"> PAGEREF _Toc242862942 \h </w:instrText>
         </w:r>
         <w:r>
           <w:rPr>
@@ -2106,7 +2106,7 @@
           <w14:ligatures w14:val="standardContextual"/>
         </w:rPr>
       </w:pPr>
-      <w:hyperlink w:anchor="_Toc242862094" w:history="1">
+      <w:hyperlink w:anchor="_Toc242862943" w:history="1">
         <w:r>
           <w:rPr>
             <w:rStyle w:val="Hyperlink"/>
@@ -2133,7 +2133,7 @@
             <w:noProof/>
             <w:webHidden/>
           </w:rPr>
-          <w:instrText xml:space="preserve"> PAGEREF _Toc242862094 \h </w:instrText>
+          <w:instrText xml:space="preserve"> PAGEREF _Toc242862943 \h </w:instrText>
         </w:r>
         <w:r>
           <w:rPr>
@@ -2179,7 +2179,7 @@
           <w14:ligatures w14:val="standardContextual"/>
         </w:rPr>
       </w:pPr>
-      <w:hyperlink w:anchor="_Toc242862095" w:history="1">
+      <w:hyperlink w:anchor="_Toc242862944" w:history="1">
         <w:r>
           <w:rPr>
             <w:rStyle w:val="Hyperlink"/>
@@ -2206,7 +2206,7 @@
             <w:noProof/>
             <w:webHidden/>
           </w:rPr>
-          <w:instrText xml:space="preserve"> PAGEREF _Toc242862095 \h </w:instrText>
+          <w:instrText xml:space="preserve"> PAGEREF _Toc242862944 \h </w:instrText>
         </w:r>
         <w:r>
           <w:rPr>
@@ -2252,7 +2252,7 @@
           <w14:ligatures w14:val="standardContextual"/>
         </w:rPr>
       </w:pPr>
-      <w:hyperlink w:anchor="_Toc242862096" w:history="1">
+      <w:hyperlink w:anchor="_Toc242862945" w:history="1">
         <w:r>
           <w:rPr>
             <w:rStyle w:val="Hyperlink"/>
@@ -2279,7 +2279,7 @@
             <w:noProof/>
             <w:webHidden/>
           </w:rPr>
-          <w:instrText xml:space="preserve"> PAGEREF _Toc242862096 \h </w:instrText>
+          <w:instrText xml:space="preserve"> PAGEREF _Toc242862945 \h </w:instrText>
         </w:r>
         <w:r>
           <w:rPr>
@@ -2325,7 +2325,7 @@
           <w14:ligatures w14:val="standardContextual"/>
         </w:rPr>
       </w:pPr>
-      <w:hyperlink w:anchor="_Toc242862097" w:history="1">
+      <w:hyperlink w:anchor="_Toc242862946" w:history="1">
         <w:r>
           <w:rPr>
             <w:rStyle w:val="Hyperlink"/>
@@ -2352,7 +2352,7 @@
             <w:noProof/>
             <w:webHidden/>
           </w:rPr>
-          <w:instrText xml:space="preserve"> PAGEREF _Toc242862097 \h </w:instrText>
+          <w:instrText xml:space="preserve"> PAGEREF _Toc242862946 \h </w:instrText>
         </w:r>
         <w:r>
           <w:rPr>
@@ -2397,7 +2397,7 @@
       <w:pPr>
         <w:pStyle w:val="Heading1"/>
       </w:pPr>
-      <w:bookmarkStart w:id="0" w:name="_Toc242862078"/>
+      <w:bookmarkStart w:id="0" w:name="_Toc242862927"/>
       <w:r>
         <w:lastRenderedPageBreak/>
         <w:t>1. Purpose</w:t>
@@ -2422,7 +2422,7 @@
       <w:pPr>
         <w:pStyle w:val="Heading2"/>
       </w:pPr>
-      <w:bookmarkStart w:id="1" w:name="_Toc242862079"/>
+      <w:bookmarkStart w:id="1" w:name="_Toc242862928"/>
       <w:r>
         <w:t>1.1 Pre-registration statement</w:t>
       </w:r>
@@ -2446,7 +2446,7 @@
       <w:pPr>
         <w:pStyle w:val="Heading2"/>
       </w:pPr>
-      <w:bookmarkStart w:id="2" w:name="_Toc242862080"/>
+      <w:bookmarkStart w:id="2" w:name="_Toc242862929"/>
       <w:r>
         <w:t>1.2 Scope</w:t>
       </w:r>
@@ -2537,7 +2537,7 @@
         <w:pStyle w:val="Heading1"/>
         <w:pageBreakBefore/>
       </w:pPr>
-      <w:bookmarkStart w:id="3" w:name="_Toc242862081"/>
+      <w:bookmarkStart w:id="3" w:name="_Toc242862930"/>
       <w:r>
         <w:lastRenderedPageBreak/>
         <w:t>2. Environment and baseline</w:t>
@@ -3027,7 +3027,7 @@
           <w:noProof/>
         </w:rPr>
         <w:drawing>
-          <wp:inline distT="0" distB="0" distL="0" distR="0" wp14:anchorId="6FF1B968" wp14:editId="2762ACCA">
+          <wp:inline distT="0" distB="0" distL="0" distR="0" wp14:anchorId="1B3A7C63" wp14:editId="2DC2AB2C">
             <wp:extent cx="5220000" cy="3132000"/>
             <wp:effectExtent l="0" t="0" r="0" b="0"/>
             <wp:docPr id="1" name="Picture 1"/>
@@ -3077,7 +3077,7 @@
         <w:pStyle w:val="Heading1"/>
         <w:pageBreakBefore/>
       </w:pPr>
-      <w:bookmarkStart w:id="4" w:name="_Toc242862082"/>
+      <w:bookmarkStart w:id="4" w:name="_Toc242862931"/>
       <w:r>
         <w:lastRenderedPageBreak/>
         <w:t>3. Approach</w:t>
@@ -3589,7 +3589,7 @@
         <w:pStyle w:val="Heading1"/>
         <w:pageBreakBefore/>
       </w:pPr>
-      <w:bookmarkStart w:id="5" w:name="_Toc242862083"/>
+      <w:bookmarkStart w:id="5" w:name="_Toc242862932"/>
       <w:r>
         <w:lastRenderedPageBreak/>
         <w:t>4. Requirements</w:t>
@@ -4621,7 +4621,7 @@
         <w:pStyle w:val="Heading1"/>
         <w:pageBreakBefore/>
       </w:pPr>
-      <w:bookmarkStart w:id="6" w:name="_Toc242862084"/>
+      <w:bookmarkStart w:id="6" w:name="_Toc242862933"/>
       <w:r>
         <w:lastRenderedPageBreak/>
         <w:t>5. Traceability matrix</w:t>
@@ -5652,7 +5652,7 @@
         <w:pStyle w:val="Heading1"/>
         <w:pageBreakBefore/>
       </w:pPr>
-      <w:bookmarkStart w:id="7" w:name="_Toc242862085"/>
+      <w:bookmarkStart w:id="7" w:name="_Toc242862934"/>
       <w:r>
         <w:lastRenderedPageBreak/>
         <w:t>6. Test cases</w:t>
@@ -5668,7 +5668,7 @@
       <w:pPr>
         <w:pStyle w:val="Heading2"/>
       </w:pPr>
-      <w:bookmarkStart w:id="8" w:name="_Toc242862086"/>
+      <w:bookmarkStart w:id="8" w:name="_Toc242862935"/>
       <w:r>
         <w:t>6.1 Automated and CLI checks</w:t>
       </w:r>
@@ -7227,7 +7227,7 @@
       <w:pPr>
         <w:pStyle w:val="Heading2"/>
       </w:pPr>
-      <w:bookmarkStart w:id="9" w:name="_Toc242862087"/>
+      <w:bookmarkStart w:id="9" w:name="_Toc242862936"/>
       <w:r>
         <w:lastRenderedPageBreak/>
         <w:t>6.2 UI tests: admin user</w:t>
@@ -10955,7 +10955,7 @@
       <w:pPr>
         <w:pStyle w:val="Heading2"/>
       </w:pPr>
-      <w:bookmarkStart w:id="10" w:name="_Toc242862088"/>
+      <w:bookmarkStart w:id="10" w:name="_Toc242862937"/>
       <w:r>
         <w:t>6.3 Holdout tests: Meridian Health Partners (first run)</w:t>
       </w:r>
@@ -14100,7 +14100,7 @@
       <w:pPr>
         <w:pStyle w:val="Heading2"/>
       </w:pPr>
-      <w:bookmarkStart w:id="11" w:name="_Toc242862089"/>
+      <w:bookmarkStart w:id="11" w:name="_Toc242862938"/>
       <w:r>
         <w:t>6.4 UI tests: least privilege</w:t>
       </w:r>
@@ -14891,7 +14891,7 @@
       <w:pPr>
         <w:pStyle w:val="Heading2"/>
       </w:pPr>
-      <w:bookmarkStart w:id="12" w:name="_Toc242862090"/>
+      <w:bookmarkStart w:id="12" w:name="_Toc242862939"/>
       <w:r>
         <w:t>6.5 Post-execution audit</w:t>
       </w:r>
@@ -15273,7 +15273,7 @@
       <w:pPr>
         <w:pStyle w:val="Heading2"/>
       </w:pPr>
-      <w:bookmarkStart w:id="13" w:name="_Toc242862091"/>
+      <w:bookmarkStart w:id="13" w:name="_Toc242862940"/>
       <w:r>
         <w:t>6.6 Not run (decided before execution)</w:t>
       </w:r>
@@ -15304,7 +15304,7 @@
         <w:pStyle w:val="Heading1"/>
         <w:pageBreakBefore/>
       </w:pPr>
-      <w:bookmarkStart w:id="14" w:name="_Toc242862092"/>
+      <w:bookmarkStart w:id="14" w:name="_Toc242862941"/>
       <w:r>
         <w:lastRenderedPageBreak/>
         <w:t>7. Deviation handling</w:t>
@@ -15401,7 +15401,7 @@
       <w:pPr>
         <w:pStyle w:val="Heading1"/>
       </w:pPr>
-      <w:bookmarkStart w:id="15" w:name="_Toc242862093"/>
+      <w:bookmarkStart w:id="15" w:name="_Toc242862942"/>
       <w:r>
         <w:t>8. Coverage gaps and test-environment limitations</w:t>
       </w:r>
@@ -15468,7 +15468,7 @@
         <w:pStyle w:val="Heading1"/>
         <w:pageBreakBefore/>
       </w:pPr>
-      <w:bookmarkStart w:id="16" w:name="_Toc242862094"/>
+      <w:bookmarkStart w:id="16" w:name="_Toc242862943"/>
       <w:r>
         <w:lastRenderedPageBreak/>
         <w:t>9. Results</w:t>
@@ -17547,7 +17547,7 @@
       <w:pPr>
         <w:pStyle w:val="Heading2"/>
       </w:pPr>
-      <w:bookmarkStart w:id="17" w:name="_Toc242862095"/>
+      <w:bookmarkStart w:id="17" w:name="_Toc242862944"/>
       <w:r>
         <w:lastRenderedPageBreak/>
         <w:t>9.1 Executed test cases</w:t>
@@ -18623,7 +18623,7 @@
               <w:rPr>
                 <w:sz w:val="19"/>
               </w:rPr>
-              <w:t>Log OWD Private; only AI_Ops (and admin/integration profiles) can read it; Banker_Summary class access exact; trusted sites present; all SOQL/DML user mode except the log insert; time estimated; see window in TC-02.md</w:t>
+              <w:t>Log OWD Private; only AI_Ops (and admin/integration profiles) can read it; Banker_Summary class access exact; trusted sites present; all SOQL/DML user mode except the log insert; time estimated; see window in TC-02.md. Clarification: System Administrator / integration-profile read access is standard platform behaviour; no banker profile or permission set has access.</w:t>
             </w:r>
           </w:p>
         </w:tc>
@@ -19359,7 +19359,7 @@
       <w:pPr>
         <w:pStyle w:val="Heading1"/>
       </w:pPr>
-      <w:bookmarkStart w:id="18" w:name="_Toc242862096"/>
+      <w:bookmarkStart w:id="18" w:name="_Toc242862945"/>
       <w:r>
         <w:t>10. Deviations</w:t>
       </w:r>
@@ -19374,7 +19374,7 @@
       <w:pPr>
         <w:pStyle w:val="Heading1"/>
       </w:pPr>
-      <w:bookmarkStart w:id="19" w:name="_Toc242862097"/>
+      <w:bookmarkStart w:id="19" w:name="_Toc242862946"/>
       <w:r>
         <w:t>11. Summary and conclusion</w:t>
       </w:r>
@@ -19781,31 +19781,31 @@
       </w:rPr>
     </w:lvl>
   </w:abstractNum>
-  <w:num w:numId="1" w16cid:durableId="487475793">
+  <w:num w:numId="1" w16cid:durableId="570584250">
     <w:abstractNumId w:val="8"/>
   </w:num>
-  <w:num w:numId="2" w16cid:durableId="455947086">
+  <w:num w:numId="2" w16cid:durableId="1054280399">
     <w:abstractNumId w:val="6"/>
   </w:num>
-  <w:num w:numId="3" w16cid:durableId="562252137">
+  <w:num w:numId="3" w16cid:durableId="1521506440">
     <w:abstractNumId w:val="5"/>
   </w:num>
-  <w:num w:numId="4" w16cid:durableId="1691567780">
+  <w:num w:numId="4" w16cid:durableId="1528178649">
     <w:abstractNumId w:val="4"/>
   </w:num>
-  <w:num w:numId="5" w16cid:durableId="1885605698">
+  <w:num w:numId="5" w16cid:durableId="1544946119">
     <w:abstractNumId w:val="7"/>
   </w:num>
-  <w:num w:numId="6" w16cid:durableId="990594381">
+  <w:num w:numId="6" w16cid:durableId="1943226603">
     <w:abstractNumId w:val="3"/>
   </w:num>
-  <w:num w:numId="7" w16cid:durableId="1628311472">
+  <w:num w:numId="7" w16cid:durableId="1237593834">
     <w:abstractNumId w:val="2"/>
   </w:num>
-  <w:num w:numId="8" w16cid:durableId="1085567226">
+  <w:num w:numId="8" w16cid:durableId="1713069349">
     <w:abstractNumId w:val="1"/>
   </w:num>
-  <w:num w:numId="9" w16cid:durableId="1084764362">
+  <w:num w:numId="9" w16cid:durableId="1099062129">
     <w:abstractNumId w:val="0"/>
   </w:num>
 </w:numbering>
@@ -31194,7 +31194,7 @@
     <w:autoRedefine/>
     <w:uiPriority w:val="39"/>
     <w:unhideWhenUsed/>
-    <w:rsid w:val="00B30517"/>
+    <w:rsid w:val="00F366C8"/>
     <w:pPr>
       <w:spacing w:after="100"/>
     </w:pPr>
@@ -31206,7 +31206,7 @@
     <w:autoRedefine/>
     <w:uiPriority w:val="39"/>
     <w:unhideWhenUsed/>
-    <w:rsid w:val="00B30517"/>
+    <w:rsid w:val="00F366C8"/>
     <w:pPr>
       <w:spacing w:after="100"/>
       <w:ind w:left="220"/>
@@ -31217,7 +31217,7 @@
     <w:basedOn w:val="DefaultParagraphFont"/>
     <w:uiPriority w:val="99"/>
     <w:unhideWhenUsed/>
-    <w:rsid w:val="00B30517"/>
+    <w:rsid w:val="00F366C8"/>
     <w:rPr>
       <w:color w:val="0000FF" w:themeColor="hyperlink"/>
       <w:u w:val="single"/>

</xml_diff>